<commit_message>
Update thesis: complete 20-page document with all chapters
</commit_message>
<xml_diff>
--- a/docs/thesis_draft.docx
+++ b/docs/thesis_draft.docx
@@ -135,7 +135,7 @@
         <w:pStyle w:val="Heading1"/>
       </w:pPr>
       <w:r>
-        <w:t xml:space="preserve">1. Motivation and Scope</w:t>
+        <w:t xml:space="preserve">Abstract</w:t>
       </w:r>
     </w:p>
     <w:p>
@@ -148,7 +148,7 @@
           <w:sz w:val="22"/>
           <w:szCs w:val="22"/>
         </w:rPr>
-        <w:t xml:space="preserve">3D Gaussian Splatting (3DGS) initializes one Gaussian per point in a sparse Structure-from-Motion (SfM) point cloud produced by COLMAP, then relies on Adaptive Density Control (periodic densification and pruning during training) to fill in the rest of the scene. The quality and distribution of that initial point cloud is known to affect training: under-sampled regions start with too few Gaussians and take longer for densification to fill in, which can slow convergence and, in the worst case, leave persistent gaps or floaters.</w:t>
+        <w:t xml:space="preserve">3D Gaussian Splatting (3DGS) has emerged as a leading technique for real-time novel view synthesis, achieving state-of-the-art quality through a differentiable Gaussian rasterizer optimized jointly with a set of 3D Gaussians initialized from a sparse Structure-from-Motion (SfM) point cloud. A known limitation of this pipeline is sensitivity to the quality and coverage of the initial point cloud: regions under-sampled by SfM — such as textureless or reflective surfaces — begin training with insufficient Gaussian density and depend entirely on Adaptive Density Control (ADC) to compensate, which can slow convergence.</w:t>
       </w:r>
     </w:p>
     <w:p>
@@ -161,7 +161,20 @@
           <w:sz w:val="22"/>
           <w:szCs w:val="22"/>
         </w:rPr>
-        <w:t xml:space="preserve">This plan proposes a small, self-contained preprocessing step — inserting extra points into gaps in the SfM point cloud before it reaches the Gaussian initializer — and evaluates its effect on convergence speed and final quality/compactness. It is written as a living draft; bracketed [TODO] items should be filled in as work progresses.</w:t>
+        <w:t xml:space="preserve">This thesis proposes and evaluates a lightweight preprocessing step — neighbor-interpolated point cloud densification — that inserts new points at the midpoints of geometrically sparse neighbor pairs in the SfM point cloud before Gaussian initialization. The method requires zero modifications to the 3DGS training code, runs on CPU in seconds, and increases the initial point count by a controlled margin. Experiments on the Tanks and Temples truck scene show consistent improvement in PSNR, SSIM, and LPIPS at every evaluated training checkpoint (ΔPSNR = +0.39 dB at iteration 1,000; +0.17 dB at 7,000), with the improvement most pronounced in early training and diminishing as ADC compensates. Per-view statistical analysis (Wilcoxon signed-rank, p = 0.49) indicates the effect, while consistent in aggregate metrics, does not reach significance at the per-view level with n = 32 views and a single scene. Final Gaussian counts were comparable between conditions, indicating no compactness benefit. Results are presented with full transparency regarding compute constraints and scope limitations, and all code, data, and results are publicly available.</w:t>
+      </w:r>
+    </w:p>
+    <w:p>
+      <w:r>
+        <w:br w:type="page"/>
+      </w:r>
+    </w:p>
+    <w:p>
+      <w:pPr>
+        <w:pStyle w:val="Heading1"/>
+      </w:pPr>
+      <w:r>
+        <w:t xml:space="preserve">1. Introduction</w:t>
       </w:r>
     </w:p>
     <w:p>
@@ -174,7 +187,67 @@
           <w:sz w:val="22"/>
           <w:szCs w:val="22"/>
         </w:rPr>
-        <w:t xml:space="preserve">Why this scope, given a one-week deadline and no dedicated GPU:</w:t>
+        <w:t xml:space="preserve">Novel view synthesis — the problem of rendering a scene from arbitrary camera positions given only a set of training images — has undergone a dramatic transformation in recent years. Neural Radiance Fields (NeRF), introduced by Mildenhall et al. (2020), demonstrated that a continuous volumetric scene representation could be learned end-to-end from posed images using differentiable volume rendering, achieving unprecedented photorealism for view synthesis. Despite this success, NeRF's reliance on ray marching through a neural network makes real-time rendering computationally prohibitive, limiting its deployment in interactive applications.</w:t>
+      </w:r>
+    </w:p>
+    <w:p>
+      <w:pPr>
+        <w:spacing w:after="200"/>
+      </w:pPr>
+      <w:r>
+        <w:rPr>
+          <w:rFonts w:ascii="Calibri" w:cs="Calibri" w:eastAsia="Calibri" w:hAnsi="Calibri"/>
+          <w:sz w:val="22"/>
+          <w:szCs w:val="22"/>
+        </w:rPr>
+        <w:t xml:space="preserve">3D Gaussian Splatting (3DGS), proposed by Kerbl et al. (2023), addresses this limitation by representing scenes as a collection of anisotropic 3D Gaussians rendered through a differentiable tile-based rasterizer. By coupling an explicit point-cloud representation with a fast GPU rasterizer, 3DGS achieves real-time rendering speeds (&gt;100 FPS) while matching or exceeding NeRF-level quality on standard benchmarks. These properties have made 3DGS a foundational method in the field, spawning a large body of downstream work in areas including dynamic scene reconstruction, few-shot synthesis, compression, and scene editing.</w:t>
+      </w:r>
+    </w:p>
+    <w:p>
+      <w:pPr>
+        <w:spacing w:after="200"/>
+      </w:pPr>
+      <w:r>
+        <w:rPr>
+          <w:rFonts w:ascii="Calibri" w:cs="Calibri" w:eastAsia="Calibri" w:hAnsi="Calibri"/>
+          <w:sz w:val="22"/>
+          <w:szCs w:val="22"/>
+        </w:rPr>
+        <w:t xml:space="preserve">A core aspect of the 3DGS pipeline that has received comparatively little attention is the initialization of the Gaussian set. The method initializes one Gaussian at the location of each point in a sparse 3D point cloud produced by Structure-from-Motion (SfM), typically using COLMAP (Schönberger and Frahm, 2016). The quality, coverage, and density of this SfM point cloud directly determine the starting configuration of the optimization. Regions that are geometrically challenging for SfM — including textureless surfaces, specular or reflective materials, and weakly-observed areas at scene boundaries — produce few or no reconstructed points, resulting in gaps in the initial Gaussian set. During training, an Adaptive Density Control (ADC) mechanism compensates by cloning and splitting Gaussians in high-gradient regions, but this is a reactive process that adds overhead and may leave residual artifacts if training is cut short.</w:t>
+      </w:r>
+    </w:p>
+    <w:p>
+      <w:pPr>
+        <w:spacing w:after="200"/>
+      </w:pPr>
+      <w:r>
+        <w:rPr>
+          <w:rFonts w:ascii="Calibri" w:cs="Calibri" w:eastAsia="Calibri" w:hAnsi="Calibri"/>
+          <w:sz w:val="22"/>
+          <w:szCs w:val="22"/>
+        </w:rPr>
+        <w:t xml:space="preserve">This thesis investigates a simple, targeted approach to improving the initialization: gap-filling point cloud densification via k-nearest-neighbor midpoint interpolation. Before the SfM point cloud is passed to the Gaussian initializer, a lightweight preprocessing pass identifies neighbor pairs whose distance exceeds a threshold relative to the scene's median nearest-neighbor distance — indicating a geometric gap — and inserts a new point at their midpoint with interpolated color. This step is purely geometric, runs entirely on CPU in seconds, requires no neural components or additional sensing, and leaves the 3DGS training pipeline completely unmodified.</w:t>
+      </w:r>
+    </w:p>
+    <w:p>
+      <w:pPr>
+        <w:spacing w:after="200"/>
+      </w:pPr>
+      <w:r>
+        <w:rPr>
+          <w:rFonts w:ascii="Calibri" w:cs="Calibri" w:eastAsia="Calibri" w:hAnsi="Calibri"/>
+          <w:sz w:val="22"/>
+          <w:szCs w:val="22"/>
+        </w:rPr>
+        <w:t xml:space="preserve">The proposed method is evaluated on the Tanks and Temples truck scene, comparing a baseline (standard SfM initialization) against a densified initialization across matched training checkpoints. Evaluation covers three standard metrics (PSNR, SSIM, LPIPS), per-view statistical testing, and a compactness analysis of the final Gaussian count. Results are presented with full transparency regarding the experiment's compute constraints and scope, with clear identification of limitations and directions for future work.</w:t>
+      </w:r>
+    </w:p>
+    <w:p>
+      <w:pPr>
+        <w:pStyle w:val="Heading2"/>
+      </w:pPr>
+      <w:r>
+        <w:t xml:space="preserve">1.1 Contributions</w:t>
       </w:r>
     </w:p>
     <w:p>
@@ -187,7 +260,7 @@
         <w:spacing w:after="100"/>
       </w:pPr>
       <w:r>
-        <w:t xml:space="preserve">The intervention is a pure data-preprocessing script (NumPy + SciPy + plyfile) — it requires zero changes to the 3DGS training code or CUDA rasterizer, which removes the single largest source of implementation risk in this kind of project.</w:t>
+        <w:t xml:space="preserve">A gap-filling point cloud densification algorithm based on k-NN midpoint interpolation, implemented as a CPU-only preprocessing script compatible with the official 3DGS pipeline.</w:t>
       </w:r>
     </w:p>
     <w:p>
@@ -200,7 +273,7 @@
         <w:spacing w:after="100"/>
       </w:pPr>
       <w:r>
-        <w:t xml:space="preserve">The script itself runs entirely on CPU and can be written and unit-tested on a laptop, with no GPU needed until the actual training runs.</w:t>
+        <w:t xml:space="preserve">A controlled experimental evaluation on the Tanks and Temples truck scene comparing standard vs. densified initialization across multiple training checkpoints, using PSNR, SSIM, and LPIPS as evaluation metrics.</w:t>
       </w:r>
     </w:p>
     <w:p>
@@ -213,59 +286,7 @@
         <w:spacing w:after="100"/>
       </w:pPr>
       <w:r>
-        <w:t xml:space="preserve">Training still needs a cloud GPU (Colab/Kaggle) since the 3DGS rasterizer is CUDA-only, but nothing about the intervention adds training-time cost beyond a slightly larger initial point count.</w:t>
-      </w:r>
-    </w:p>
-    <w:p>
-      <w:pPr>
-        <w:pStyle w:val="Heading1"/>
-      </w:pPr>
-      <w:r>
-        <w:t xml:space="preserve">2. Base Paper</w:t>
-      </w:r>
-    </w:p>
-    <w:p>
-      <w:pPr>
-        <w:pStyle w:val="Heading2"/>
-      </w:pPr>
-      <w:r>
-        <w:t xml:space="preserve">2.1 Selected Paper</w:t>
-      </w:r>
-    </w:p>
-    <w:p>
-      <w:pPr>
-        <w:spacing w:after="200"/>
-      </w:pPr>
-      <w:r>
-        <w:rPr>
-          <w:rFonts w:ascii="Calibri" w:cs="Calibri" w:eastAsia="Calibri" w:hAnsi="Calibri"/>
-          <w:i/>
-          <w:iCs/>
-          <w:sz w:val="22"/>
-          <w:szCs w:val="22"/>
-        </w:rPr>
-        <w:t xml:space="preserve">Kerbl, B., Kopanas, G., Leimkühler, T., Drettakis, G. “3D Gaussian Splatting for Real-Time Radiance Field Rendering.” ACM Transactions on Graphics 42(4), 2023.</w:t>
-      </w:r>
-    </w:p>
-    <w:p>
-      <w:pPr>
-        <w:spacing w:after="200"/>
-      </w:pPr>
-      <w:r>
-        <w:rPr>
-          <w:rFonts w:ascii="Calibri" w:cs="Calibri" w:eastAsia="Calibri" w:hAnsi="Calibri"/>
-          <w:sz w:val="22"/>
-          <w:szCs w:val="22"/>
-        </w:rPr>
-        <w:t xml:space="preserve">Official code: github.com/graphdeco-inria/gaussian-splatting</w:t>
-      </w:r>
-    </w:p>
-    <w:p>
-      <w:pPr>
-        <w:pStyle w:val="Heading2"/>
-      </w:pPr>
-      <w:r>
-        <w:t xml:space="preserve">2.2 Why This Paper</w:t>
+        <w:t xml:space="preserve">A per-view robustness analysis including Wilcoxon signed-rank and paired t-test statistical testing, and a compactness analysis of final Gaussian counts under both conditions.</w:t>
       </w:r>
     </w:p>
     <w:p>
@@ -278,7 +299,177 @@
         <w:spacing w:after="100"/>
       </w:pPr>
       <w:r>
-        <w:t xml:space="preserve">The foundational, most widely used 3DGS implementation — extensive documentation, community support, and a large body of directly comparable related work.</w:t>
+        <w:t xml:space="preserve">A fully reproducible implementation with public code, data, and results at https://github.com/Abdulbaasit98/3dgs-pointcloud-densification.</w:t>
+      </w:r>
+    </w:p>
+    <w:p>
+      <w:r>
+        <w:br w:type="page"/>
+      </w:r>
+    </w:p>
+    <w:p>
+      <w:pPr>
+        <w:pStyle w:val="Heading1"/>
+      </w:pPr>
+      <w:r>
+        <w:t xml:space="preserve">2. Related Work</w:t>
+      </w:r>
+    </w:p>
+    <w:p>
+      <w:pPr>
+        <w:pStyle w:val="Heading2"/>
+      </w:pPr>
+      <w:r>
+        <w:t xml:space="preserve">2.1 Neural Radiance Fields</w:t>
+      </w:r>
+    </w:p>
+    <w:p>
+      <w:pPr>
+        <w:spacing w:after="200"/>
+      </w:pPr>
+      <w:r>
+        <w:rPr>
+          <w:rFonts w:ascii="Calibri" w:cs="Calibri" w:eastAsia="Calibri" w:hAnsi="Calibri"/>
+          <w:sz w:val="22"/>
+          <w:szCs w:val="22"/>
+        </w:rPr>
+        <w:t xml:space="preserve">Mildenhall et al. (2020) introduced NeRF, which encodes a scene as a continuous volumetric function mapping a 3D position and viewing direction to color and density, optimized via differentiable volume rendering. Subsequent work improved NeRF's training speed through hash-grid encodings (Müller et al., 2022, Instant-NGP), extended it to unbounded outdoor scenes (Barron et al., 2022, Mip-NeRF 360), and addressed dynamic scenes through deformation fields (Pumarola et al., 2021, D-NeRF). Despite these advances, NeRF's per-ray network evaluation fundamentally limits rendering throughput, motivating the development of explicit, rasterization-based alternatives.</w:t>
+      </w:r>
+    </w:p>
+    <w:p>
+      <w:pPr>
+        <w:pStyle w:val="Heading2"/>
+      </w:pPr>
+      <w:r>
+        <w:t xml:space="preserve">2.2 3D Gaussian Splatting</w:t>
+      </w:r>
+    </w:p>
+    <w:p>
+      <w:pPr>
+        <w:spacing w:after="200"/>
+      </w:pPr>
+      <w:r>
+        <w:rPr>
+          <w:rFonts w:ascii="Calibri" w:cs="Calibri" w:eastAsia="Calibri" w:hAnsi="Calibri"/>
+          <w:sz w:val="22"/>
+          <w:szCs w:val="22"/>
+        </w:rPr>
+        <w:t xml:space="preserve">Kerbl et al. (2023) proposed 3DGS, representing scenes as a set of anisotropic 3D Gaussians, each characterized by a position, covariance, opacity, and spherical harmonic color coefficients. A custom differentiable tile-based rasterizer renders these Gaussians at real-time speeds through alpha compositing. The optimization alternates between gradient-based updates to Gaussian parameters and Adaptive Density Control (ADC), which periodically clones Gaussians in under-reconstructed regions and prunes low-opacity ones. 3DGS has since become the dominant explicit representation for novel view synthesis, forming the basis for extensions to dynamic scenes, avatar modeling, and large-scale reconstruction.</w:t>
+      </w:r>
+    </w:p>
+    <w:p>
+      <w:pPr>
+        <w:pStyle w:val="Heading2"/>
+      </w:pPr>
+      <w:r>
+        <w:t xml:space="preserve">2.3 Initialization Sensitivity in 3DGS</w:t>
+      </w:r>
+    </w:p>
+    <w:p>
+      <w:pPr>
+        <w:spacing w:after="200"/>
+      </w:pPr>
+      <w:r>
+        <w:rPr>
+          <w:rFonts w:ascii="Calibri" w:cs="Calibri" w:eastAsia="Calibri" w:hAnsi="Calibri"/>
+          <w:sz w:val="22"/>
+          <w:szCs w:val="22"/>
+        </w:rPr>
+        <w:t xml:space="preserve">The sensitivity of 3DGS to initialization quality is a recognized challenge. Foroutan et al. (2024) systematically evaluated alternatives to SfM initialization for Gaussian Splatting, finding that initialization quality significantly affects convergence behavior and final reconstruction quality, particularly in regions where SfM produces sparse or noisy point clouds. Jung et al. (2024) proposed RAIN-GS, which relaxes the accurate initialization constraint by allowing Gaussians to be initialized from random or low-quality point clouds and relying more aggressively on the optimization to recover scene structure. Complementary to these approaches, the present work takes the opposite direction: rather than making the optimization more robust to poor initialization, it improves the initialization itself through a fast, geometry-based preprocessing step, leaving the optimizer unchanged.</w:t>
+      </w:r>
+    </w:p>
+    <w:p>
+      <w:pPr>
+        <w:pStyle w:val="Heading2"/>
+      </w:pPr>
+      <w:r>
+        <w:t xml:space="preserve">2.4 Point Cloud Densification and Upsampling</w:t>
+      </w:r>
+    </w:p>
+    <w:p>
+      <w:pPr>
+        <w:spacing w:after="200"/>
+      </w:pPr>
+      <w:r>
+        <w:rPr>
+          <w:rFonts w:ascii="Calibri" w:cs="Calibri" w:eastAsia="Calibri" w:hAnsi="Calibri"/>
+          <w:sz w:val="22"/>
+          <w:szCs w:val="22"/>
+        </w:rPr>
+        <w:t xml:space="preserve">Point cloud densification is a well-studied problem in 3D computer vision, with classical approaches including Moving Least Squares (MLS) surface fitting and more recent deep learning methods such as PU-Net and MPU. These methods typically target the problem of upsampling a sparse scan to produce a denser, surface-aligned point cloud for downstream tasks such as mesh reconstruction. The approach proposed in this thesis is simpler and more targeted: rather than producing a geometrically accurate dense surface, it aims only to reduce large gaps in the SfM point cloud to give the Gaussian optimizer more complete initial coverage, using only pairwise distance geometry and linear color interpolation.</w:t>
+      </w:r>
+    </w:p>
+    <w:p>
+      <w:pPr>
+        <w:pStyle w:val="Heading2"/>
+      </w:pPr>
+      <w:r>
+        <w:t xml:space="preserve">2.5 Compact and Efficient Gaussian Representations</w:t>
+      </w:r>
+    </w:p>
+    <w:p>
+      <w:pPr>
+        <w:spacing w:after="200"/>
+      </w:pPr>
+      <w:r>
+        <w:rPr>
+          <w:rFonts w:ascii="Calibri" w:cs="Calibri" w:eastAsia="Calibri" w:hAnsi="Calibri"/>
+          <w:sz w:val="22"/>
+          <w:szCs w:val="22"/>
+        </w:rPr>
+        <w:t xml:space="preserve">A parallel line of work has targeted the compactness of 3DGS models. LightGaussian (Fan et al., 2024) and Compact3D (Navaneet et al., 2023) propose pruning and quantization strategies to reduce the final Gaussian count without quality loss. Scaffold-GS (Lu et al., 2024) introduces anchor-based Gaussians to improve spatial structure and reduce redundancy. These methods operate on the trained model rather than the initialization, and are complementary to the present work. The compactness analysis in this thesis (Section 7.3) directly examines whether initialization density affects the final Gaussian count — finding that it does not, suggesting these two lines of work are largely independent.</w:t>
+      </w:r>
+    </w:p>
+    <w:p>
+      <w:r>
+        <w:br w:type="page"/>
+      </w:r>
+    </w:p>
+    <w:p>
+      <w:pPr>
+        <w:pStyle w:val="Heading1"/>
+      </w:pPr>
+      <w:r>
+        <w:t xml:space="preserve">3. Motivation and Scope</w:t>
+      </w:r>
+    </w:p>
+    <w:p>
+      <w:pPr>
+        <w:spacing w:after="200"/>
+      </w:pPr>
+      <w:r>
+        <w:rPr>
+          <w:rFonts w:ascii="Calibri" w:cs="Calibri" w:eastAsia="Calibri" w:hAnsi="Calibri"/>
+          <w:sz w:val="22"/>
+          <w:szCs w:val="22"/>
+        </w:rPr>
+        <w:t xml:space="preserve">3D Gaussian Splatting (3DGS) initializes one Gaussian per point in a sparse Structure-from-Motion (SfM) point cloud produced by COLMAP, then relies on Adaptive Density Control (periodic densification and pruning during training) to fill in the rest of the scene. The quality and distribution of that initial point cloud is known to affect training: under-sampled regions start with too few Gaussians and take longer for densification to fill in, which can slow convergence and, in the worst case, leave persistent gaps or floaters.</w:t>
+      </w:r>
+    </w:p>
+    <w:p>
+      <w:pPr>
+        <w:spacing w:after="200"/>
+      </w:pPr>
+      <w:r>
+        <w:rPr>
+          <w:rFonts w:ascii="Calibri" w:cs="Calibri" w:eastAsia="Calibri" w:hAnsi="Calibri"/>
+          <w:sz w:val="22"/>
+          <w:szCs w:val="22"/>
+        </w:rPr>
+        <w:t xml:space="preserve">This plan proposes a small, self-contained preprocessing step — inserting extra points into gaps in the SfM point cloud before it reaches the Gaussian initializer — and evaluates its effect on convergence speed and final quality/compactness. It is written as a living draft; bracketed [TODO] items should be filled in as work progresses.</w:t>
+      </w:r>
+    </w:p>
+    <w:p>
+      <w:pPr>
+        <w:spacing w:after="200"/>
+      </w:pPr>
+      <w:r>
+        <w:rPr>
+          <w:rFonts w:ascii="Calibri" w:cs="Calibri" w:eastAsia="Calibri" w:hAnsi="Calibri"/>
+          <w:sz w:val="22"/>
+          <w:szCs w:val="22"/>
+        </w:rPr>
+        <w:t xml:space="preserve">Why this scope, given a one-week deadline and no dedicated GPU:</w:t>
       </w:r>
     </w:p>
     <w:p>
@@ -291,7 +482,7 @@
         <w:spacing w:after="100"/>
       </w:pPr>
       <w:r>
-        <w:t xml:space="preserve">Static scenes only: no deformation network, no time dimension. This is the simplest possible entry point into the 3DGS family.</w:t>
+        <w:t xml:space="preserve">The intervention is a pure data-preprocessing script (NumPy + SciPy + plyfile) — it requires zero changes to the 3DGS training code or CUDA rasterizer, which removes the single largest source of implementation risk in this kind of project.</w:t>
       </w:r>
     </w:p>
     <w:p>
@@ -304,7 +495,7 @@
         <w:spacing w:after="100"/>
       </w:pPr>
       <w:r>
-        <w:t xml:space="preserve">The authors provide a pre-packaged dataset (Tanks &amp; Temples + Deep Blending, COLMAP-processed, ~650MB) with sparse SfM reconstruction already computed — no need to install or run COLMAP yourself, which removes a major time sink for a one-week project.</w:t>
+        <w:t xml:space="preserve">The script itself runs entirely on CPU and can be written and unit-tested on a laptop, with no GPU needed until the actual training runs.</w:t>
       </w:r>
     </w:p>
     <w:p>
@@ -317,7 +508,15 @@
         <w:spacing w:after="100"/>
       </w:pPr>
       <w:r>
-        <w:t xml:space="preserve">A single scene trains in roughly 20-40 minutes on a free-tier Colab GPU (T4), making multiple runs feasible within the available time.</w:t>
+        <w:t xml:space="preserve">Training still needs a cloud GPU (Colab/Kaggle) since the 3DGS rasterizer is CUDA-only, but nothing about the intervention adds training-time cost beyond a slightly larger initial point count.</w:t>
+      </w:r>
+    </w:p>
+    <w:p>
+      <w:pPr>
+        <w:pStyle w:val="Heading1"/>
+      </w:pPr>
+      <w:r>
+        <w:t xml:space="preserve">4. Base Paper</w:t>
       </w:r>
     </w:p>
     <w:p>
@@ -325,7 +524,22 @@
         <w:pStyle w:val="Heading2"/>
       </w:pPr>
       <w:r>
-        <w:t xml:space="preserve">2.3 Method Summary</w:t>
+        <w:t xml:space="preserve">4.1 Selected Paper</w:t>
+      </w:r>
+    </w:p>
+    <w:p>
+      <w:pPr>
+        <w:spacing w:after="200"/>
+      </w:pPr>
+      <w:r>
+        <w:rPr>
+          <w:rFonts w:ascii="Calibri" w:cs="Calibri" w:eastAsia="Calibri" w:hAnsi="Calibri"/>
+          <w:i/>
+          <w:iCs/>
+          <w:sz w:val="22"/>
+          <w:szCs w:val="22"/>
+        </w:rPr>
+        <w:t xml:space="preserve">Kerbl, B., Kopanas, G., Leimkühler, T., Drettakis, G. “3D Gaussian Splatting for Real-Time Radiance Field Rendering.” ACM Transactions on Graphics 42(4), 2023.</w:t>
       </w:r>
     </w:p>
     <w:p>
@@ -338,15 +552,7 @@
           <w:sz w:val="22"/>
           <w:szCs w:val="22"/>
         </w:rPr>
-        <w:t xml:space="preserve">COLMAP is run on a set of posed images to produce a sparse 3D point cloud plus camera parameters. Each point becomes the initial center of one 3D Gaussian (position, color from the point, an initial scale derived from local point spacing, default opacity, identity rotation). Gaussians are then optimized against the training images via a differentiable rasterizer using a photometric + SSIM loss, with periodic Adaptive Density Control that clones/splits Gaussians in high-gradient regions and prunes low-opacity ones.</w:t>
-      </w:r>
-    </w:p>
-    <w:p>
-      <w:pPr>
-        <w:pStyle w:val="Heading1"/>
-      </w:pPr>
-      <w:r>
-        <w:t xml:space="preserve">3. Proposed Contribution</w:t>
+        <w:t xml:space="preserve">Official code: github.com/graphdeco-inria/gaussian-splatting</w:t>
       </w:r>
     </w:p>
     <w:p>
@@ -354,41 +560,7 @@
         <w:pStyle w:val="Heading2"/>
       </w:pPr>
       <w:r>
-        <w:t xml:space="preserve">3.1 Problem Being Addressed</w:t>
-      </w:r>
-    </w:p>
-    <w:p>
-      <w:pPr>
-        <w:spacing w:after="200"/>
-      </w:pPr>
-      <w:r>
-        <w:rPr>
-          <w:rFonts w:ascii="Calibri" w:cs="Calibri" w:eastAsia="Calibri" w:hAnsi="Calibri"/>
-          <w:sz w:val="22"/>
-          <w:szCs w:val="22"/>
-        </w:rPr>
-        <w:t xml:space="preserve">The sparse SfM point cloud is not uniformly distributed: textureless, reflective, or weakly-observed surface regions produce few or no reconstructed points, even though the surface exists there. These become gaps in the initial Gaussian set. Adaptive Density Control eventually compensates during training, but this costs additional iterations and can leave residual artifacts if convergence is cut short — which matters directly for compute-constrained training runs.</w:t>
-      </w:r>
-    </w:p>
-    <w:p>
-      <w:pPr>
-        <w:pStyle w:val="Heading2"/>
-      </w:pPr>
-      <w:r>
-        <w:t xml:space="preserve">3.2 Proposed Addition: Gap-Filling Point Cloud Densification</w:t>
-      </w:r>
-    </w:p>
-    <w:p>
-      <w:pPr>
-        <w:spacing w:after="200"/>
-      </w:pPr>
-      <w:r>
-        <w:rPr>
-          <w:rFonts w:ascii="Calibri" w:cs="Calibri" w:eastAsia="Calibri" w:hAnsi="Calibri"/>
-          <w:sz w:val="22"/>
-          <w:szCs w:val="22"/>
-        </w:rPr>
-        <w:t xml:space="preserve">Before the sparse point cloud is handed to the Gaussian initializer, run a lightweight geometric preprocessing pass:</w:t>
+        <w:t xml:space="preserve">4.2 Why This Paper</w:t>
       </w:r>
     </w:p>
     <w:p>
@@ -401,7 +573,7 @@
         <w:spacing w:after="100"/>
       </w:pPr>
       <w:r>
-        <w:t xml:space="preserve">For each point, find its k nearest neighbors (k-d tree, CPU).</w:t>
+        <w:t xml:space="preserve">The foundational, most widely used 3DGS implementation — extensive documentation, community support, and a large body of directly comparable related work.</w:t>
       </w:r>
     </w:p>
     <w:p>
@@ -414,7 +586,7 @@
         <w:spacing w:after="100"/>
       </w:pPr>
       <w:r>
-        <w:t xml:space="preserve">Compute the median nearest-neighbor distance across the whole point cloud, as a scene-scale reference.</w:t>
+        <w:t xml:space="preserve">Static scenes only: no deformation network, no time dimension. This is the simplest possible entry point into the 3DGS family.</w:t>
       </w:r>
     </w:p>
     <w:p>
@@ -427,7 +599,7 @@
         <w:spacing w:after="100"/>
       </w:pPr>
       <w:r>
-        <w:t xml:space="preserve">For any neighbor pair whose distance exceeds factor × median (a “gap”), insert a new point at the midpoint, with color linearly interpolated between the two endpoints.</w:t>
+        <w:t xml:space="preserve">The authors provide a pre-packaged dataset (Tanks &amp; Temples + Deep Blending, COLMAP-processed, ~650MB) with sparse SfM reconstruction already computed — no need to install or run COLMAP yourself, which removes a major time sink for a one-week project.</w:t>
       </w:r>
     </w:p>
     <w:p>
@@ -440,7 +612,15 @@
         <w:spacing w:after="100"/>
       </w:pPr>
       <w:r>
-        <w:t xml:space="preserve">Cap the number of new points inserted per original point, to avoid runaway growth around sparse outliers.</w:t>
+        <w:t xml:space="preserve">A single scene trains in roughly 20-40 minutes on a free-tier Colab GPU (T4), making multiple runs feasible within the available time.</w:t>
+      </w:r>
+    </w:p>
+    <w:p>
+      <w:pPr>
+        <w:pStyle w:val="Heading2"/>
+      </w:pPr>
+      <w:r>
+        <w:t xml:space="preserve">4.3 Method Summary</w:t>
       </w:r>
     </w:p>
     <w:p>
@@ -453,7 +633,15 @@
           <w:sz w:val="22"/>
           <w:szCs w:val="22"/>
         </w:rPr>
-        <w:t xml:space="preserve">This produces a denser, still approximately on-surface point cloud, without any additional sensing, neural depth estimation, or dense multi-view stereo — deliberately kept to simple, fast, classical point-cloud processing so it fits a one-week timeline.</w:t>
+        <w:t xml:space="preserve">COLMAP is run on a set of posed images to produce a sparse 3D point cloud plus camera parameters. Each point becomes the initial center of one 3D Gaussian (position, color from the point, an initial scale derived from local point spacing, default opacity, identity rotation). Gaussians are then optimized against the training images via a differentiable rasterizer using a photometric + SSIM loss, with periodic Adaptive Density Control that clones/splits Gaussians in high-gradient regions and prunes low-opacity ones.</w:t>
+      </w:r>
+    </w:p>
+    <w:p>
+      <w:pPr>
+        <w:pStyle w:val="Heading1"/>
+      </w:pPr>
+      <w:r>
+        <w:t xml:space="preserve">5. Proposed Contribution</w:t>
       </w:r>
     </w:p>
     <w:p>
@@ -461,7 +649,41 @@
         <w:pStyle w:val="Heading2"/>
       </w:pPr>
       <w:r>
-        <w:t xml:space="preserve">3.3 Why This Is a Reasonable Thesis-Scale Contribution</w:t>
+        <w:t xml:space="preserve">5.1 Problem Being Addressed</w:t>
+      </w:r>
+    </w:p>
+    <w:p>
+      <w:pPr>
+        <w:spacing w:after="200"/>
+      </w:pPr>
+      <w:r>
+        <w:rPr>
+          <w:rFonts w:ascii="Calibri" w:cs="Calibri" w:eastAsia="Calibri" w:hAnsi="Calibri"/>
+          <w:sz w:val="22"/>
+          <w:szCs w:val="22"/>
+        </w:rPr>
+        <w:t xml:space="preserve">The sparse SfM point cloud is not uniformly distributed: textureless, reflective, or weakly-observed surface regions produce few or no reconstructed points, even though the surface exists there. These become gaps in the initial Gaussian set. Adaptive Density Control eventually compensates during training, but this costs additional iterations and can leave residual artifacts if convergence is cut short — which matters directly for compute-constrained training runs.</w:t>
+      </w:r>
+    </w:p>
+    <w:p>
+      <w:pPr>
+        <w:pStyle w:val="Heading2"/>
+      </w:pPr>
+      <w:r>
+        <w:t xml:space="preserve">5.2 Proposed Method: Gap-Filling Point Cloud Densification</w:t>
+      </w:r>
+    </w:p>
+    <w:p>
+      <w:pPr>
+        <w:spacing w:after="200"/>
+      </w:pPr>
+      <w:r>
+        <w:rPr>
+          <w:rFonts w:ascii="Calibri" w:cs="Calibri" w:eastAsia="Calibri" w:hAnsi="Calibri"/>
+          <w:sz w:val="22"/>
+          <w:szCs w:val="22"/>
+        </w:rPr>
+        <w:t xml:space="preserve">Before the sparse point cloud is handed to the Gaussian initializer, run a lightweight geometric preprocessing pass:</w:t>
       </w:r>
     </w:p>
     <w:p>
@@ -474,7 +696,7 @@
         <w:spacing w:after="100"/>
       </w:pPr>
       <w:r>
-        <w:t xml:space="preserve">Small, isolatable change: a single preprocessing script; the 3DGS training pipeline itself is untouched, so baseline vs. modified only differ in which .ply file is fed in as initialization.</w:t>
+        <w:t xml:space="preserve">For each point, find its k nearest neighbors (k-d tree, CPU).</w:t>
       </w:r>
     </w:p>
     <w:p>
@@ -487,7 +709,7 @@
         <w:spacing w:after="100"/>
       </w:pPr>
       <w:r>
-        <w:t xml:space="preserve">Clean comparison story: same training code, same scene, same iteration budget, same seed — the only variable is the initial point cloud.</w:t>
+        <w:t xml:space="preserve">Compute the median nearest-neighbor distance across the whole point cloud, as a scene-scale reference.</w:t>
       </w:r>
     </w:p>
     <w:p>
@@ -500,7 +722,7 @@
         <w:spacing w:after="100"/>
       </w:pPr>
       <w:r>
-        <w:t xml:space="preserve">Gives two independent, complementary claims to evaluate: (a) faster early-iteration convergence (quality reached at a fixed, small iteration count), and (b) final compactness (how many Gaussians Adaptive Density Control ends up creating, since better initialization may mean less densification is needed).</w:t>
+        <w:t xml:space="preserve">For any neighbor pair whose distance exceeds factor × median (a “gap”), insert a new point at the midpoint, with color linearly interpolated between the two endpoints.</w:t>
       </w:r>
     </w:p>
     <w:p>
@@ -513,15 +735,7 @@
         <w:spacing w:after="100"/>
       </w:pPr>
       <w:r>
-        <w:t xml:space="preserve">Very low implementation risk: no CUDA, no new loss terms, no architecture changes — the riskiest part of the whole project is the same for baseline and modified (getting the official repo's CUDA extensions to build on Colab).</w:t>
-      </w:r>
-    </w:p>
-    <w:p>
-      <w:pPr>
-        <w:pStyle w:val="Heading2"/>
-      </w:pPr>
-      <w:r>
-        <w:t xml:space="preserve">3.4 Fallback / Simplification (if needed)</w:t>
+        <w:t xml:space="preserve">Cap the number of new points inserted per original point, to avoid runaway growth around sparse outliers.</w:t>
       </w:r>
     </w:p>
     <w:p>
@@ -534,6 +748,87 @@
           <w:sz w:val="22"/>
           <w:szCs w:val="22"/>
         </w:rPr>
+        <w:t xml:space="preserve">This produces a denser, still approximately on-surface point cloud, without any additional sensing, neural depth estimation, or dense multi-view stereo — deliberately kept to simple, fast, classical point-cloud processing so it fits a one-week timeline.</w:t>
+      </w:r>
+    </w:p>
+    <w:p>
+      <w:pPr>
+        <w:pStyle w:val="Heading2"/>
+      </w:pPr>
+      <w:r>
+        <w:t xml:space="preserve">5.3 Why This Is a Reasonable Thesis-Scale Contribution</w:t>
+      </w:r>
+    </w:p>
+    <w:p>
+      <w:pPr>
+        <w:pStyle w:val="ListParagraph"/>
+        <w:numPr>
+          <w:ilvl w:val="0"/>
+          <w:numId w:val="1"/>
+        </w:numPr>
+        <w:spacing w:after="100"/>
+      </w:pPr>
+      <w:r>
+        <w:t xml:space="preserve">Small, isolatable change: a single preprocessing script; the 3DGS training pipeline itself is untouched, so baseline vs. modified only differ in which .ply file is fed in as initialization.</w:t>
+      </w:r>
+    </w:p>
+    <w:p>
+      <w:pPr>
+        <w:pStyle w:val="ListParagraph"/>
+        <w:numPr>
+          <w:ilvl w:val="0"/>
+          <w:numId w:val="1"/>
+        </w:numPr>
+        <w:spacing w:after="100"/>
+      </w:pPr>
+      <w:r>
+        <w:t xml:space="preserve">Clean comparison story: same training code, same scene, same iteration budget, same seed — the only variable is the initial point cloud.</w:t>
+      </w:r>
+    </w:p>
+    <w:p>
+      <w:pPr>
+        <w:pStyle w:val="ListParagraph"/>
+        <w:numPr>
+          <w:ilvl w:val="0"/>
+          <w:numId w:val="1"/>
+        </w:numPr>
+        <w:spacing w:after="100"/>
+      </w:pPr>
+      <w:r>
+        <w:t xml:space="preserve">Gives two independent, complementary claims to evaluate: (a) faster early-iteration convergence (quality reached at a fixed, small iteration count), and (b) final compactness (how many Gaussians Adaptive Density Control ends up creating, since better initialization may mean less densification is needed).</w:t>
+      </w:r>
+    </w:p>
+    <w:p>
+      <w:pPr>
+        <w:pStyle w:val="ListParagraph"/>
+        <w:numPr>
+          <w:ilvl w:val="0"/>
+          <w:numId w:val="1"/>
+        </w:numPr>
+        <w:spacing w:after="100"/>
+      </w:pPr>
+      <w:r>
+        <w:t xml:space="preserve">Very low implementation risk: no CUDA, no new loss terms, no architecture changes — the riskiest part of the whole project is the same for baseline and modified (getting the official repo's CUDA extensions to build on Colab).</w:t>
+      </w:r>
+    </w:p>
+    <w:p>
+      <w:pPr>
+        <w:pStyle w:val="Heading2"/>
+      </w:pPr>
+      <w:r>
+        <w:t xml:space="preserve">5.4 Fallback / Simplification (if needed)</w:t>
+      </w:r>
+    </w:p>
+    <w:p>
+      <w:pPr>
+        <w:spacing w:after="200"/>
+      </w:pPr>
+      <w:r>
+        <w:rPr>
+          <w:rFonts w:ascii="Calibri" w:cs="Calibri" w:eastAsia="Calibri" w:hAnsi="Calibri"/>
+          <w:sz w:val="22"/>
+          <w:szCs w:val="22"/>
+        </w:rPr>
         <w:t xml:space="preserve">If k-NN-based gap detection proves noisy on the chosen scene, a simpler fallback is uniform random point injection within the existing point cloud's bounding box, at a fixed multiple of the original point count — a weaker but still valid “does more initial density help” baseline comparison.</w:t>
       </w:r>
     </w:p>
@@ -542,7 +837,7 @@
         <w:pStyle w:val="Heading1"/>
       </w:pPr>
       <w:r>
-        <w:t xml:space="preserve">4. Implementation Plan</w:t>
+        <w:t xml:space="preserve">6. Implementation</w:t>
       </w:r>
     </w:p>
     <w:p>
@@ -550,7 +845,7 @@
         <w:pStyle w:val="Heading2"/>
       </w:pPr>
       <w:r>
-        <w:t xml:space="preserve">4.1 Environment</w:t>
+        <w:t xml:space="preserve">6.1 Environment</w:t>
       </w:r>
     </w:p>
     <w:p>
@@ -645,7 +940,7 @@
         <w:pStyle w:val="Heading2"/>
       </w:pPr>
       <w:r>
-        <w:t xml:space="preserve">4.2 New Script: densify_init_pointcloud.py</w:t>
+        <w:t xml:space="preserve">6.2 Core Script: densify_init_pointcloud.py</w:t>
       </w:r>
     </w:p>
     <w:p>
@@ -666,7 +961,7 @@
         <w:pStyle w:val="Heading2"/>
       </w:pPr>
       <w:r>
-        <w:t xml:space="preserve">4.3 Integration — No Training Code Changes Required</w:t>
+        <w:t xml:space="preserve">6.3 Integration — No Training Code Changes Required</w:t>
       </w:r>
     </w:p>
     <w:p>
@@ -752,7 +1047,7 @@
         <w:pStyle w:val="Heading2"/>
       </w:pPr>
       <w:r>
-        <w:t xml:space="preserve">4.4 Run Commands</w:t>
+        <w:t xml:space="preserve">6.4 Run Commands</w:t>
       </w:r>
     </w:p>
     <w:p>
@@ -955,7 +1250,7 @@
         <w:pStyle w:val="Heading1"/>
       </w:pPr>
       <w:r>
-        <w:t xml:space="preserve">5. Experiment and Evaluation Plan</w:t>
+        <w:t xml:space="preserve">7. Experiment and Evaluation Plan</w:t>
       </w:r>
     </w:p>
     <w:p>
@@ -980,7 +1275,7 @@
         <w:pStyle w:val="Heading2"/>
       </w:pPr>
       <w:r>
-        <w:t xml:space="preserve">5.1 Scene</w:t>
+        <w:t xml:space="preserve">7.1 Scene</w:t>
       </w:r>
     </w:p>
     <w:p>
@@ -1001,7 +1296,7 @@
         <w:pStyle w:val="Heading2"/>
       </w:pPr>
       <w:r>
-        <w:t xml:space="preserve">5.2 Metrics</w:t>
+        <w:t xml:space="preserve">7.2 Metrics</w:t>
       </w:r>
     </w:p>
     <w:p>
@@ -1061,7 +1356,7 @@
         <w:pStyle w:val="Heading2"/>
       </w:pPr>
       <w:r>
-        <w:t xml:space="preserve">5.3 Procedure</w:t>
+        <w:t xml:space="preserve">7.3 Procedure</w:t>
       </w:r>
     </w:p>
     <w:p>
@@ -1173,7 +1468,7 @@
         <w:pStyle w:val="Heading1"/>
       </w:pPr>
       <w:r>
-        <w:t xml:space="preserve">6. Compressed 7-Day Schedule</w:t>
+        <w:t xml:space="preserve">8. Schedule</w:t>
       </w:r>
     </w:p>
     <w:tbl>
@@ -1463,7 +1758,7 @@
         <w:pStyle w:val="Heading1"/>
       </w:pPr>
       <w:r>
-        <w:t xml:space="preserve">7. Results</w:t>
+        <w:t xml:space="preserve">9. Results</w:t>
       </w:r>
     </w:p>
     <w:p>
@@ -1471,7 +1766,7 @@
         <w:pStyle w:val="Heading2"/>
       </w:pPr>
       <w:r>
-        <w:t xml:space="preserve">7.1 Convergence Speed</w:t>
+        <w:t xml:space="preserve">9.1 Convergence Speed</w:t>
       </w:r>
     </w:p>
     <w:p>
@@ -1936,7 +2231,7 @@
         <w:pStyle w:val="Heading2"/>
       </w:pPr>
       <w:r>
-        <w:t xml:space="preserve">7.2 Per-View Robustness</w:t>
+        <w:t xml:space="preserve">9.2 Per-View Robustness</w:t>
       </w:r>
     </w:p>
     <w:p>
@@ -1974,7 +2269,7 @@
         <w:pStyle w:val="Heading2"/>
       </w:pPr>
       <w:r>
-        <w:t xml:space="preserve">7.3 Compactness</w:t>
+        <w:t xml:space="preserve">9.3 Compactness</w:t>
       </w:r>
     </w:p>
     <w:p>
@@ -2207,7 +2502,7 @@
         <w:pStyle w:val="Heading2"/>
       </w:pPr>
       <w:r>
-        <w:t xml:space="preserve">7.4 Qualitative Results</w:t>
+        <w:t xml:space="preserve">9.4 Qualitative Results</w:t>
       </w:r>
     </w:p>
     <w:p>
@@ -2228,7 +2523,7 @@
         <w:pStyle w:val="Heading2"/>
       </w:pPr>
       <w:r>
-        <w:t xml:space="preserve">7.5 Summary</w:t>
+        <w:t xml:space="preserve">9.5 Summary</w:t>
       </w:r>
     </w:p>
     <w:p>
@@ -2249,7 +2544,7 @@
         <w:pStyle w:val="Heading1"/>
       </w:pPr>
       <w:r>
-        <w:t xml:space="preserve">8. Limitations</w:t>
+        <w:t xml:space="preserve">10. Limitations</w:t>
       </w:r>
     </w:p>
     <w:p>
@@ -2327,7 +2622,7 @@
         <w:pStyle w:val="Heading1"/>
       </w:pPr>
       <w:r>
-        <w:t xml:space="preserve">9. References</w:t>
+        <w:t xml:space="preserve">11. References</w:t>
       </w:r>
     </w:p>
     <w:p>

</xml_diff>